<commit_message>
update doc and md
</commit_message>
<xml_diff>
--- a/documents/Bia Baocao_Tomtat_De tai ca nhan.docx
+++ b/documents/Bia Baocao_Tomtat_De tai ca nhan.docx
@@ -489,6 +489,7 @@
         </w:rPr>
         <w:t xml:space="preserve">: </w:t>
       </w:r>
+      <w:proofErr w:type="spellStart"/>
       <w:r>
         <w:rPr>
           <w:b/>
@@ -496,8 +497,27 @@
           <w:sz w:val="28"/>
           <w:szCs w:val="28"/>
         </w:rPr>
-        <w:t>TS</w:t>
-      </w:r>
+        <w:t>T</w:t>
+      </w:r>
+      <w:r>
+        <w:rPr>
+          <w:b/>
+          <w:spacing w:val="-1"/>
+          <w:sz w:val="28"/>
+          <w:szCs w:val="28"/>
+        </w:rPr>
+        <w:t>h</w:t>
+      </w:r>
+      <w:r>
+        <w:rPr>
+          <w:b/>
+          <w:spacing w:val="-1"/>
+          <w:sz w:val="28"/>
+          <w:szCs w:val="28"/>
+        </w:rPr>
+        <w:t>S</w:t>
+      </w:r>
+      <w:proofErr w:type="spellEnd"/>
       <w:r>
         <w:rPr>
           <w:b/>

</xml_diff>